<commit_message>
Match email replies to the exact candidate via reference tag, not email alone
</commit_message>
<xml_diff>
--- a/ResumeParser_Architecture.docx
+++ b/ResumeParser_Architecture.docx
@@ -1113,7 +1113,7 @@
         <w:spacing w:after="80"/>
       </w:pPr>
       <w:r>
-        <w:t xml:space="preserve">Load every candidate with an email on file and status in ("parsed", "documents_submitted").</w:t>
+        <w:t xml:space="preserve">Load every candidate with an email on file and status in ("parsed", "documents_submitted"), then group them by lowercased email address — two candidate rows can legitimately share one email (typos, re-applications, duplicate uploads), so grouping avoids searching IMAP twice for the same sender.</w:t>
       </w:r>
     </w:p>
     <w:p>
@@ -1139,7 +1139,7 @@
         <w:spacing w:after="80"/>
       </w:pPr>
       <w:r>
-        <w:t xml:space="preserve">For each candidate, run a targeted search: UNSEEN + FROM &lt;candidate email&gt;. This is the important part — an early version searched bare UNSEEN across the whole mailbox, which on a real inbox with hundreds of unread newsletters timed out before ever reaching the candidate's reply. Scoping the search server-side to one sender at a time keeps each poll fast regardless of inbox size.</w:t>
+        <w:t xml:space="preserve">For each unique email address, run a targeted search: UNSEEN + FROM &lt;email&gt;. This is the important part — an early version searched bare UNSEEN across the whole mailbox, which on a real inbox with hundreds of unread newsletters timed out before ever reaching the candidate's reply. Scoping the search server-side to one sender at a time keeps each poll fast regardless of inbox size.</w:t>
       </w:r>
     </w:p>
     <w:p>
@@ -1165,6 +1165,19 @@
         <w:spacing w:after="80"/>
       </w:pPr>
       <w:r>
+        <w:t xml:space="preserve">Resolve exactly which candidate the reply belongs to (see 4.3 below) — this step exists specifically because "matched by email" is not the same as "matched by candidate."</w:t>
+      </w:r>
+    </w:p>
+    <w:p>
+      <w:pPr>
+        <w:pStyle w:val="ListParagraph"/>
+        <w:numPr>
+          <w:ilvl w:val="0"/>
+          <w:numId w:val="2"/>
+        </w:numPr>
+        <w:spacing w:after="80"/>
+      </w:pPr>
+      <w:r>
         <w:t xml:space="preserve">Pass the attachment filenames to classify_attachments() (attachment_classifier.py), which asks the LLM which index is the PAN and which is the Aadhaar.</w:t>
       </w:r>
     </w:p>
@@ -1187,6 +1200,75 @@
       </w:pPr>
       <w:r>
         <w:t xml:space="preserve">If no candidates are awaiting documents, or IMAP isn't configured, poll_inbox() returns immediately with a "skipped" result instead of doing any network I/O.</w:t>
+      </w:r>
+    </w:p>
+    <w:p>
+      <w:pPr>
+        <w:pStyle w:val="Heading2"/>
+        <w:spacing w:after="120" w:before="260"/>
+      </w:pPr>
+      <w:r>
+        <w:t xml:space="preserve">4.3 Disambiguating which candidate a reply belongs to</w:t>
+      </w:r>
+    </w:p>
+    <w:p>
+      <w:pPr>
+        <w:spacing w:after="160"/>
+      </w:pPr>
+      <w:r>
+        <w:t xml:space="preserve">Matching a reply purely by "From this email address" breaks the moment two candidate rows share an email — attaching a reply to the wrong candidate is worse than not attaching it at all. To make the match precise, every outbound document-request email carries a reference tag, [Ref: RP-&lt;candidate_id&gt;], appended to both the subject and the message body at send time (request_documents in candidates.py) — not something the LLM drafts or the HR user can accidentally edit away, since it's appended after the message is finalized.</w:t>
+      </w:r>
+    </w:p>
+    <w:p>
+      <w:pPr>
+        <w:pStyle w:val="ListParagraph"/>
+        <w:numPr>
+          <w:ilvl w:val="0"/>
+          <w:numId w:val="2"/>
+        </w:numPr>
+        <w:spacing w:after="80"/>
+      </w:pPr>
+      <w:r>
+        <w:t xml:space="preserve">_resolve_candidate() first searches the reply's subject, then its plain-text body, for the [Ref: RP-&lt;id&gt;] pattern.</w:t>
+      </w:r>
+    </w:p>
+    <w:p>
+      <w:pPr>
+        <w:pStyle w:val="ListParagraph"/>
+        <w:numPr>
+          <w:ilvl w:val="0"/>
+          <w:numId w:val="2"/>
+        </w:numPr>
+        <w:spacing w:after="80"/>
+      </w:pPr>
+      <w:r>
+        <w:t xml:space="preserve">If a tag is found, it resolves directly to that candidate id — correct even when other candidates share the same email address.</w:t>
+      </w:r>
+    </w:p>
+    <w:p>
+      <w:pPr>
+        <w:pStyle w:val="ListParagraph"/>
+        <w:numPr>
+          <w:ilvl w:val="0"/>
+          <w:numId w:val="2"/>
+        </w:numPr>
+        <w:spacing w:after="80"/>
+      </w:pPr>
+      <w:r>
+        <w:t xml:space="preserve">If no tag is found and exactly one candidate shares that email, it falls back to that candidate (the common case: one candidate, one reply, tag lost by an unusual mail client).</w:t>
+      </w:r>
+    </w:p>
+    <w:p>
+      <w:pPr>
+        <w:pStyle w:val="ListParagraph"/>
+        <w:numPr>
+          <w:ilvl w:val="0"/>
+          <w:numId w:val="2"/>
+        </w:numPr>
+        <w:spacing w:after="80"/>
+      </w:pPr>
+      <w:r>
+        <w:t xml:space="preserve">If no tag is found and more than one candidate shares that email, the service refuses to guess — it reports status "ambiguous" and leaves the message unattached (still marked \Seen so it isn't retried forever) rather than risk filing someone's PAN/Aadhaar under the wrong profile.</w:t>
       </w:r>
     </w:p>
     <w:p>

</xml_diff>

<commit_message>
Move candidate reference tag into an invisible Reply-To header, not the visible email
</commit_message>
<xml_diff>
--- a/ResumeParser_Architecture.docx
+++ b/ResumeParser_Architecture.docx
@@ -1216,20 +1216,20 @@
         <w:spacing w:after="160"/>
       </w:pPr>
       <w:r>
-        <w:t xml:space="preserve">Matching a reply purely by "From this email address" breaks the moment two candidate rows share an email — attaching a reply to the wrong candidate is worse than not attaching it at all. To make the match precise, every outbound document-request email carries a reference tag, [Ref: RP-&lt;candidate_id&gt;], appended to both the subject and the message body at send time (request_documents in candidates.py) — not something the LLM drafts or the HR user can accidentally edit away, since it's appended after the message is finalized.</w:t>
-      </w:r>
-    </w:p>
-    <w:p>
-      <w:pPr>
-        <w:pStyle w:val="ListParagraph"/>
-        <w:numPr>
-          <w:ilvl w:val="0"/>
-          <w:numId w:val="2"/>
-        </w:numPr>
-        <w:spacing w:after="80"/>
-      </w:pPr>
-      <w:r>
-        <w:t xml:space="preserve">_resolve_candidate() first searches the reply's subject, then its plain-text body, for the [Ref: RP-&lt;id&gt;] pattern.</w:t>
+        <w:t xml:space="preserve">Matching a reply purely by "From this email address" breaks the moment two candidate rows share an email — attaching a reply to the wrong candidate is worse than not attaching it at all. An earlier version appended a visible [Ref: RP-&lt;id&gt;] tag to the subject/body, but that read as unprofessional clutter in a real email. The current approach is invisible instead: request_documents in candidates.py sets Reply-To to a plus-addressed variant of the sending mailbox — e.g. abattu97+rp7@gmail.com for candidate 7 (plus_address() in notification.py). Gmail (and most major providers) deliver plus-addressed mail to the base inbox unchanged while preserving the full address in the recipient headers, so nothing is appended to what the candidate actually reads, but the tag survives into their reply if their client respects Reply-To (nearly universal).</w:t>
+      </w:r>
+    </w:p>
+    <w:p>
+      <w:pPr>
+        <w:pStyle w:val="ListParagraph"/>
+        <w:numPr>
+          <w:ilvl w:val="0"/>
+          <w:numId w:val="2"/>
+        </w:numPr>
+        <w:spacing w:after="80"/>
+      </w:pPr>
+      <w:r>
+        <w:t xml:space="preserve">_resolve_candidate() checks the reply's Delivered-To, To, X-Original-To, and Envelope-To headers for a +rp&lt;id&gt;@ pattern (PLUS_TAG_RE in email_ingestion.py).</w:t>
       </w:r>
     </w:p>
     <w:p>
@@ -1255,7 +1255,7 @@
         <w:spacing w:after="80"/>
       </w:pPr>
       <w:r>
-        <w:t xml:space="preserve">If no tag is found and exactly one candidate shares that email, it falls back to that candidate (the common case: one candidate, one reply, tag lost by an unusual mail client).</w:t>
+        <w:t xml:space="preserve">If no tag is found and exactly one candidate shares that email, it falls back to that candidate (the common case: one candidate, one reply, tag lost because a client ignored Reply-To).</w:t>
       </w:r>
     </w:p>
     <w:p>

</xml_diff>